<commit_message>
Edit docs. Game Vision update and create pdf
</commit_message>
<xml_diff>
--- a/docs/product/docFiles/game-vision.docx
+++ b/docs/product/docFiles/game-vision.docx
@@ -4,11 +4,64 @@
   <w:body>
     <w:p>
       <w:pPr>
-        <w:pStyle w:val="Titel"/>
+        <w:jc w:val="center"/>
+        <w:rPr>
+          <w:lang w:eastAsia="de-DE"/>
+        </w:rPr>
       </w:pPr>
       <w:r>
-        <w:t>Game Vision</w:t>
+        <w:rPr>
+          <w:noProof/>
+        </w:rPr>
+        <w:drawing>
+          <wp:inline distT="0" distB="0" distL="0" distR="0" wp14:anchorId="63A57654" wp14:editId="2C36931A">
+            <wp:extent cx="3285066" cy="967619"/>
+            <wp:effectExtent l="0" t="0" r="4445" b="0"/>
+            <wp:docPr id="346673291" name="Grafik 1"/>
+            <wp:cNvGraphicFramePr>
+              <a:graphicFrameLocks xmlns:a="http://schemas.openxmlformats.org/drawingml/2006/main" noChangeAspect="1"/>
+            </wp:cNvGraphicFramePr>
+            <a:graphic xmlns:a="http://schemas.openxmlformats.org/drawingml/2006/main">
+              <a:graphicData uri="http://schemas.openxmlformats.org/drawingml/2006/picture">
+                <pic:pic xmlns:pic="http://schemas.openxmlformats.org/drawingml/2006/picture">
+                  <pic:nvPicPr>
+                    <pic:cNvPr id="346673291" name="Grafik 346673291"/>
+                    <pic:cNvPicPr/>
+                  </pic:nvPicPr>
+                  <pic:blipFill>
+                    <a:blip r:embed="rId7" cstate="print">
+                      <a:extLst>
+                        <a:ext uri="{28A0092B-C50C-407E-A947-70E740481C1C}">
+                          <a14:useLocalDpi xmlns:a14="http://schemas.microsoft.com/office/drawing/2010/main" val="0"/>
+                        </a:ext>
+                      </a:extLst>
+                    </a:blip>
+                    <a:stretch>
+                      <a:fillRect/>
+                    </a:stretch>
+                  </pic:blipFill>
+                  <pic:spPr>
+                    <a:xfrm>
+                      <a:off x="0" y="0"/>
+                      <a:ext cx="3362642" cy="990469"/>
+                    </a:xfrm>
+                    <a:prstGeom prst="rect">
+                      <a:avLst/>
+                    </a:prstGeom>
+                  </pic:spPr>
+                </pic:pic>
+              </a:graphicData>
+            </a:graphic>
+          </wp:inline>
+        </w:drawing>
       </w:r>
+    </w:p>
+    <w:p>
+      <w:pPr>
+        <w:rPr>
+          <w:lang w:eastAsia="de-DE"/>
+        </w:rPr>
+      </w:pPr>
     </w:p>
     <w:p>
       <w:pPr>
@@ -21,29 +74,6 @@
           <w:lang w:eastAsia="de-DE"/>
         </w:rPr>
         <w:t>Escape the Computer ist ein 2D-Lernspiel im comicartigen Look, das Kindern und Computer-Neulingen die grundlegenden Hardwarekomponenten eines PCs beibringt - nicht als Text zum Nachlesen, sondern eingebaut in die Spielmechanik selbst.</w:t>
-      </w:r>
-    </w:p>
-    <w:p>
-      <w:pPr>
-        <w:rPr>
-          <w:lang w:eastAsia="de-DE"/>
-        </w:rPr>
-      </w:pPr>
-    </w:p>
-    <w:p>
-      <w:pPr>
-        <w:pStyle w:val="etcueberschrift1"/>
-        <w:rPr>
-          <w:lang w:eastAsia="de-DE"/>
-        </w:rPr>
-      </w:pPr>
-      <w:r>
-        <w:t>Spielwelt</w:t>
-      </w:r>
-    </w:p>
-    <w:p>
-      <w:r>
-        <w:t>Das Spielfeld ist ein Motherboard von oben, im vollen Comic-Stil. Zu Beginn wirkt die Welt gedämpft (entsättigt, ruhig, kein Ton). Mit jeder aktivierten Station verändert sich das Board sicht- und hörbar — Fortschritt wird direkt in der Spielwelt sichtbar.</w:t>
       </w:r>
     </w:p>
     <w:p>
@@ -69,6 +99,39 @@
         <w:t>Nibble (Fachbegriff: 4 Bit = ein halbes Byte) hat vier Bits, die gleichzeitig seine vier Lebenspunkte sind — der Fachbegriff wird so direkt erlebbar statt erklärt. Der Lebensstand wird zusätzlich als Batterieanzeige dargestellt.</w:t>
       </w:r>
     </w:p>
+    <w:p>
+      <w:pPr>
+        <w:rPr>
+          <w:lang w:eastAsia="de-DE"/>
+        </w:rPr>
+      </w:pPr>
+    </w:p>
+    <w:p>
+      <w:pPr>
+        <w:pStyle w:val="etcueberschrift1"/>
+        <w:rPr>
+          <w:rFonts w:cs="Menlo"/>
+          <w:lang w:eastAsia="de-DE"/>
+        </w:rPr>
+      </w:pPr>
+      <w:r>
+        <w:rPr>
+          <w:rFonts w:cs="Menlo"/>
+        </w:rPr>
+        <w:t>Spielwelt</w:t>
+      </w:r>
+      <w:r>
+        <w:rPr>
+          <w:rFonts w:cs="Menlo"/>
+        </w:rPr>
+        <w:t>: Motherboard</w:t>
+      </w:r>
+    </w:p>
+    <w:p>
+      <w:r>
+        <w:t>Das Spielfeld ist ein Motherboard von oben, im vollen Comic-Stil. Zu Beginn wirkt die Welt gedämpft (entsättigt, ruhig, kein Ton). Mit jeder aktivierten Station verändert sich das Board sicht- und hörbar — Fortschritt wird direkt in der Spielwelt sichtbar.</w:t>
+      </w:r>
+    </w:p>
     <w:p/>
     <w:p>
       <w:pPr>
@@ -175,6 +238,19 @@
         </w:rPr>
         <w:t>USB-Anschluss — letzte Station, führt zum Spielende</w:t>
       </w:r>
+    </w:p>
+    <w:p>
+      <w:pPr>
+        <w:pStyle w:val="etcaufzaehlung"/>
+        <w:numPr>
+          <w:ilvl w:val="0"/>
+          <w:numId w:val="0"/>
+        </w:numPr>
+        <w:ind w:left="681"/>
+        <w:rPr>
+          <w:lang w:eastAsia="de-DE"/>
+        </w:rPr>
+      </w:pPr>
     </w:p>
     <w:p>
       <w:pPr>
@@ -225,28 +301,74 @@
         <w:t>Kombination aus Anzahl zerstörter Bits und verstrichener Zeit — sowohl offensives Verteidigen als auch zügiges Spielen zahlen sich aus.</w:t>
       </w:r>
     </w:p>
-    <w:p>
-      <w:pPr>
-        <w:rPr>
-          <w:lang w:eastAsia="de-DE"/>
-        </w:rPr>
-      </w:pPr>
-    </w:p>
-    <w:p>
-      <w:pPr>
-        <w:rPr>
-          <w:lang w:eastAsia="de-DE"/>
-        </w:rPr>
-      </w:pPr>
-    </w:p>
     <w:sectPr>
+      <w:footerReference w:type="default" r:id="rId8"/>
       <w:pgSz w:w="11900" w:h="16840"/>
-      <w:pgMar w:top="1417" w:right="1417" w:bottom="1134" w:left="1417" w:header="708" w:footer="708" w:gutter="0"/>
+      <w:pgMar w:top="567" w:right="1418" w:bottom="1134" w:left="1418" w:header="709" w:footer="709" w:gutter="0"/>
       <w:cols w:space="708"/>
       <w:docGrid w:linePitch="360"/>
     </w:sectPr>
   </w:body>
 </w:document>
+</file>
+
+<file path=word/endnotes.xml><?xml version="1.0" encoding="utf-8"?>
+<w:endnotes xmlns:wpc="http://schemas.microsoft.com/office/word/2010/wordprocessingCanvas" xmlns:cx="http://schemas.microsoft.com/office/drawing/2014/chartex" xmlns:cx1="http://schemas.microsoft.com/office/drawing/2015/9/8/chartex" xmlns:cx2="http://schemas.microsoft.com/office/drawing/2015/10/21/chartex" xmlns:cx3="http://schemas.microsoft.com/office/drawing/2016/5/9/chartex" xmlns:cx4="http://schemas.microsoft.com/office/drawing/2016/5/10/chartex" xmlns:cx5="http://schemas.microsoft.com/office/drawing/2016/5/11/chartex" xmlns:cx6="http://schemas.microsoft.com/office/drawing/2016/5/12/chartex" xmlns:cx7="http://schemas.microsoft.com/office/drawing/2016/5/13/chartex" xmlns:cx8="http://schemas.microsoft.com/office/drawing/2016/5/14/chartex" xmlns:mc="http://schemas.openxmlformats.org/markup-compatibility/2006" xmlns:m="http://schemas.openxmlformats.org/officeDocument/2006/math" xmlns:aink="http://schemas.microsoft.com/office/drawing/2016/ink" xmlns:am3d="http://schemas.microsoft.com/office/drawing/2017/model3d" xmlns:oel="http://schemas.microsoft.com/office/2019/extlst" xmlns:r="http://schemas.openxmlformats.org/officeDocument/2006/relationships" xmlns:wp14="http://schemas.microsoft.com/office/word/2010/wordprocessingDrawing" xmlns:wp="http://schemas.openxmlformats.org/drawingml/2006/wordprocessingDrawing" xmlns:wpg="http://schemas.microsoft.com/office/word/2010/wordprocessingGroup" xmlns:wpi="http://schemas.microsoft.com/office/word/2010/wordprocessingInk" xmlns:wps="http://schemas.microsoft.com/office/word/2010/wordprocessingShape" xmlns:o="urn:schemas-microsoft-com:office:office" xmlns:v="urn:schemas-microsoft-com:vml" xmlns:w10="urn:schemas-microsoft-com:office:word" xmlns:w="http://schemas.openxmlformats.org/wordprocessingml/2006/main" xmlns:w14="http://schemas.microsoft.com/office/word/2010/wordml" xmlns:w15="http://schemas.microsoft.com/office/word/2012/wordml" xmlns:w16cex="http://schemas.microsoft.com/office/word/2018/wordml/cex" xmlns:w16cid="http://schemas.microsoft.com/office/word/2016/wordml/cid" xmlns:w16="http://schemas.microsoft.com/office/word/2018/wordml" xmlns:w16sdtdh="http://schemas.microsoft.com/office/word/2020/wordml/sdtdatahash" xmlns:w16sdtfl="http://schemas.microsoft.com/office/word/2024/wordml/sdtformatlock" xmlns:w16se="http://schemas.microsoft.com/office/word/2015/wordml/symex" xmlns:w16du="http://schemas.microsoft.com/office/word/2023/wordml/word16du" xmlns:wne="http://schemas.microsoft.com/office/word/2006/wordml" mc:Ignorable="w14 w15 w16se w16cid w16 w16cex w16sdtdh w16sdtfl w16du wp14">
+  <w:endnote w:type="separator" w:id="-1">
+    <w:p>
+      <w:r>
+        <w:separator/>
+      </w:r>
+    </w:p>
+  </w:endnote>
+  <w:endnote w:type="continuationSeparator" w:id="0">
+    <w:p>
+      <w:r>
+        <w:continuationSeparator/>
+      </w:r>
+    </w:p>
+  </w:endnote>
+</w:endnotes>
+</file>
+
+<file path=word/footer1.xml><?xml version="1.0" encoding="utf-8"?>
+<w:ftr xmlns:wpc="http://schemas.microsoft.com/office/word/2010/wordprocessingCanvas" xmlns:cx="http://schemas.microsoft.com/office/drawing/2014/chartex" xmlns:cx1="http://schemas.microsoft.com/office/drawing/2015/9/8/chartex" xmlns:cx2="http://schemas.microsoft.com/office/drawing/2015/10/21/chartex" xmlns:cx3="http://schemas.microsoft.com/office/drawing/2016/5/9/chartex" xmlns:cx4="http://schemas.microsoft.com/office/drawing/2016/5/10/chartex" xmlns:cx5="http://schemas.microsoft.com/office/drawing/2016/5/11/chartex" xmlns:cx6="http://schemas.microsoft.com/office/drawing/2016/5/12/chartex" xmlns:cx7="http://schemas.microsoft.com/office/drawing/2016/5/13/chartex" xmlns:cx8="http://schemas.microsoft.com/office/drawing/2016/5/14/chartex" xmlns:mc="http://schemas.openxmlformats.org/markup-compatibility/2006" xmlns:m="http://schemas.openxmlformats.org/officeDocument/2006/math" xmlns:aink="http://schemas.microsoft.com/office/drawing/2016/ink" xmlns:am3d="http://schemas.microsoft.com/office/drawing/2017/model3d" xmlns:oel="http://schemas.microsoft.com/office/2019/extlst" xmlns:r="http://schemas.openxmlformats.org/officeDocument/2006/relationships" xmlns:wp14="http://schemas.microsoft.com/office/word/2010/wordprocessingDrawing" xmlns:wp="http://schemas.openxmlformats.org/drawingml/2006/wordprocessingDrawing" xmlns:wpg="http://schemas.microsoft.com/office/word/2010/wordprocessingGroup" xmlns:wpi="http://schemas.microsoft.com/office/word/2010/wordprocessingInk" xmlns:wps="http://schemas.microsoft.com/office/word/2010/wordprocessingShape" xmlns:o="urn:schemas-microsoft-com:office:office" xmlns:v="urn:schemas-microsoft-com:vml" xmlns:w10="urn:schemas-microsoft-com:office:word" xmlns:w="http://schemas.openxmlformats.org/wordprocessingml/2006/main" xmlns:w14="http://schemas.microsoft.com/office/word/2010/wordml" xmlns:w15="http://schemas.microsoft.com/office/word/2012/wordml" xmlns:w16cex="http://schemas.microsoft.com/office/word/2018/wordml/cex" xmlns:w16cid="http://schemas.microsoft.com/office/word/2016/wordml/cid" xmlns:w16="http://schemas.microsoft.com/office/word/2018/wordml" xmlns:w16sdtdh="http://schemas.microsoft.com/office/word/2020/wordml/sdtdatahash" xmlns:w16sdtfl="http://schemas.microsoft.com/office/word/2024/wordml/sdtformatlock" xmlns:w16se="http://schemas.microsoft.com/office/word/2015/wordml/symex" xmlns:w16du="http://schemas.microsoft.com/office/word/2023/wordml/word16du" xmlns:wne="http://schemas.microsoft.com/office/word/2006/wordml" mc:Ignorable="w14 w15 w16se w16cid w16 w16cex w16sdtdh w16sdtfl w16du wp14">
+  <w:p>
+    <w:pPr>
+      <w:pStyle w:val="Fuzeile"/>
+      <w:rPr>
+        <w:sz w:val="16"/>
+        <w:szCs w:val="16"/>
+      </w:rPr>
+    </w:pPr>
+    <w:r>
+      <w:rPr>
+        <w:sz w:val="16"/>
+        <w:szCs w:val="16"/>
+      </w:rPr>
+      <w:t>© 2026 Melanie Erkinger, Oliver Flora, Mario Mack</w:t>
+    </w:r>
+  </w:p>
+</w:ftr>
+</file>
+
+<file path=word/footnotes.xml><?xml version="1.0" encoding="utf-8"?>
+<w:footnotes xmlns:wpc="http://schemas.microsoft.com/office/word/2010/wordprocessingCanvas" xmlns:cx="http://schemas.microsoft.com/office/drawing/2014/chartex" xmlns:cx1="http://schemas.microsoft.com/office/drawing/2015/9/8/chartex" xmlns:cx2="http://schemas.microsoft.com/office/drawing/2015/10/21/chartex" xmlns:cx3="http://schemas.microsoft.com/office/drawing/2016/5/9/chartex" xmlns:cx4="http://schemas.microsoft.com/office/drawing/2016/5/10/chartex" xmlns:cx5="http://schemas.microsoft.com/office/drawing/2016/5/11/chartex" xmlns:cx6="http://schemas.microsoft.com/office/drawing/2016/5/12/chartex" xmlns:cx7="http://schemas.microsoft.com/office/drawing/2016/5/13/chartex" xmlns:cx8="http://schemas.microsoft.com/office/drawing/2016/5/14/chartex" xmlns:mc="http://schemas.openxmlformats.org/markup-compatibility/2006" xmlns:m="http://schemas.openxmlformats.org/officeDocument/2006/math" xmlns:aink="http://schemas.microsoft.com/office/drawing/2016/ink" xmlns:am3d="http://schemas.microsoft.com/office/drawing/2017/model3d" xmlns:oel="http://schemas.microsoft.com/office/2019/extlst" xmlns:r="http://schemas.openxmlformats.org/officeDocument/2006/relationships" xmlns:wp14="http://schemas.microsoft.com/office/word/2010/wordprocessingDrawing" xmlns:wp="http://schemas.openxmlformats.org/drawingml/2006/wordprocessingDrawing" xmlns:wpg="http://schemas.microsoft.com/office/word/2010/wordprocessingGroup" xmlns:wpi="http://schemas.microsoft.com/office/word/2010/wordprocessingInk" xmlns:wps="http://schemas.microsoft.com/office/word/2010/wordprocessingShape" xmlns:o="urn:schemas-microsoft-com:office:office" xmlns:v="urn:schemas-microsoft-com:vml" xmlns:w10="urn:schemas-microsoft-com:office:word" xmlns:w="http://schemas.openxmlformats.org/wordprocessingml/2006/main" xmlns:w14="http://schemas.microsoft.com/office/word/2010/wordml" xmlns:w15="http://schemas.microsoft.com/office/word/2012/wordml" xmlns:w16cex="http://schemas.microsoft.com/office/word/2018/wordml/cex" xmlns:w16cid="http://schemas.microsoft.com/office/word/2016/wordml/cid" xmlns:w16="http://schemas.microsoft.com/office/word/2018/wordml" xmlns:w16sdtdh="http://schemas.microsoft.com/office/word/2020/wordml/sdtdatahash" xmlns:w16sdtfl="http://schemas.microsoft.com/office/word/2024/wordml/sdtformatlock" xmlns:w16se="http://schemas.microsoft.com/office/word/2015/wordml/symex" xmlns:w16du="http://schemas.microsoft.com/office/word/2023/wordml/word16du" xmlns:wne="http://schemas.microsoft.com/office/word/2006/wordml" mc:Ignorable="w14 w15 w16se w16cid w16 w16cex w16sdtdh w16sdtfl w16du wp14">
+  <w:footnote w:type="separator" w:id="-1">
+    <w:p>
+      <w:r>
+        <w:separator/>
+      </w:r>
+    </w:p>
+  </w:footnote>
+  <w:footnote w:type="continuationSeparator" w:id="0">
+    <w:p>
+      <w:r>
+        <w:continuationSeparator/>
+      </w:r>
+    </w:p>
+  </w:footnote>
+</w:footnotes>
 </file>
 
 <file path=word/numbering.xml><?xml version="1.0" encoding="utf-8"?>
@@ -767,6 +889,93 @@
     </w:lvl>
   </w:abstractNum>
   <w:abstractNum w:abstractNumId="5" w15:restartNumberingAfterBreak="0">
+    <w:nsid w:val="4A8F0B2E"/>
+    <w:multiLevelType w:val="hybridMultilevel"/>
+    <w:tmpl w:val="1CA068CA"/>
+    <w:lvl w:ilvl="0" w:tplc="3B743F8C">
+      <w:start w:val="1"/>
+      <w:numFmt w:val="decimal"/>
+      <w:pStyle w:val="etcueberschrift1"/>
+      <w:lvlText w:val="%1."/>
+      <w:lvlJc w:val="left"/>
+      <w:pPr>
+        <w:ind w:left="720" w:hanging="360"/>
+      </w:pPr>
+    </w:lvl>
+    <w:lvl w:ilvl="1" w:tplc="04070019" w:tentative="1">
+      <w:start w:val="1"/>
+      <w:numFmt w:val="lowerLetter"/>
+      <w:lvlText w:val="%2."/>
+      <w:lvlJc w:val="left"/>
+      <w:pPr>
+        <w:ind w:left="1440" w:hanging="360"/>
+      </w:pPr>
+    </w:lvl>
+    <w:lvl w:ilvl="2" w:tplc="0407001B" w:tentative="1">
+      <w:start w:val="1"/>
+      <w:numFmt w:val="lowerRoman"/>
+      <w:lvlText w:val="%3."/>
+      <w:lvlJc w:val="right"/>
+      <w:pPr>
+        <w:ind w:left="2160" w:hanging="180"/>
+      </w:pPr>
+    </w:lvl>
+    <w:lvl w:ilvl="3" w:tplc="0407000F" w:tentative="1">
+      <w:start w:val="1"/>
+      <w:numFmt w:val="decimal"/>
+      <w:lvlText w:val="%4."/>
+      <w:lvlJc w:val="left"/>
+      <w:pPr>
+        <w:ind w:left="2880" w:hanging="360"/>
+      </w:pPr>
+    </w:lvl>
+    <w:lvl w:ilvl="4" w:tplc="04070019" w:tentative="1">
+      <w:start w:val="1"/>
+      <w:numFmt w:val="lowerLetter"/>
+      <w:lvlText w:val="%5."/>
+      <w:lvlJc w:val="left"/>
+      <w:pPr>
+        <w:ind w:left="3600" w:hanging="360"/>
+      </w:pPr>
+    </w:lvl>
+    <w:lvl w:ilvl="5" w:tplc="0407001B" w:tentative="1">
+      <w:start w:val="1"/>
+      <w:numFmt w:val="lowerRoman"/>
+      <w:lvlText w:val="%6."/>
+      <w:lvlJc w:val="right"/>
+      <w:pPr>
+        <w:ind w:left="4320" w:hanging="180"/>
+      </w:pPr>
+    </w:lvl>
+    <w:lvl w:ilvl="6" w:tplc="0407000F" w:tentative="1">
+      <w:start w:val="1"/>
+      <w:numFmt w:val="decimal"/>
+      <w:lvlText w:val="%7."/>
+      <w:lvlJc w:val="left"/>
+      <w:pPr>
+        <w:ind w:left="5040" w:hanging="360"/>
+      </w:pPr>
+    </w:lvl>
+    <w:lvl w:ilvl="7" w:tplc="04070019" w:tentative="1">
+      <w:start w:val="1"/>
+      <w:numFmt w:val="lowerLetter"/>
+      <w:lvlText w:val="%8."/>
+      <w:lvlJc w:val="left"/>
+      <w:pPr>
+        <w:ind w:left="5760" w:hanging="360"/>
+      </w:pPr>
+    </w:lvl>
+    <w:lvl w:ilvl="8" w:tplc="0407001B" w:tentative="1">
+      <w:start w:val="1"/>
+      <w:numFmt w:val="lowerRoman"/>
+      <w:lvlText w:val="%9."/>
+      <w:lvlJc w:val="right"/>
+      <w:pPr>
+        <w:ind w:left="6480" w:hanging="180"/>
+      </w:pPr>
+    </w:lvl>
+  </w:abstractNum>
+  <w:abstractNum w:abstractNumId="6" w15:restartNumberingAfterBreak="0">
     <w:nsid w:val="59974841"/>
     <w:multiLevelType w:val="hybridMultilevel"/>
     <w:tmpl w:val="6366BB82"/>
@@ -879,7 +1088,7 @@
       </w:rPr>
     </w:lvl>
   </w:abstractNum>
-  <w:abstractNum w:abstractNumId="6" w15:restartNumberingAfterBreak="0">
+  <w:abstractNum w:abstractNumId="7" w15:restartNumberingAfterBreak="0">
     <w:nsid w:val="5B8F4A59"/>
     <w:multiLevelType w:val="hybridMultilevel"/>
     <w:tmpl w:val="D438F0AE"/>
@@ -992,7 +1201,7 @@
       </w:rPr>
     </w:lvl>
   </w:abstractNum>
-  <w:abstractNum w:abstractNumId="7" w15:restartNumberingAfterBreak="0">
+  <w:abstractNum w:abstractNumId="8" w15:restartNumberingAfterBreak="0">
     <w:nsid w:val="5C3D621B"/>
     <w:multiLevelType w:val="hybridMultilevel"/>
     <w:tmpl w:val="F512480E"/>
@@ -1105,7 +1314,7 @@
       </w:rPr>
     </w:lvl>
   </w:abstractNum>
-  <w:abstractNum w:abstractNumId="8" w15:restartNumberingAfterBreak="0">
+  <w:abstractNum w:abstractNumId="9" w15:restartNumberingAfterBreak="0">
     <w:nsid w:val="640A2D16"/>
     <w:multiLevelType w:val="multilevel"/>
     <w:tmpl w:val="AEB87E90"/>
@@ -1254,7 +1463,7 @@
       </w:rPr>
     </w:lvl>
   </w:abstractNum>
-  <w:abstractNum w:abstractNumId="9" w15:restartNumberingAfterBreak="0">
+  <w:abstractNum w:abstractNumId="10" w15:restartNumberingAfterBreak="0">
     <w:nsid w:val="679349CA"/>
     <w:multiLevelType w:val="multilevel"/>
     <w:tmpl w:val="35D8E76A"/>
@@ -1403,7 +1612,7 @@
       </w:rPr>
     </w:lvl>
   </w:abstractNum>
-  <w:abstractNum w:abstractNumId="10" w15:restartNumberingAfterBreak="0">
+  <w:abstractNum w:abstractNumId="11" w15:restartNumberingAfterBreak="0">
     <w:nsid w:val="6B1F633F"/>
     <w:multiLevelType w:val="hybridMultilevel"/>
     <w:tmpl w:val="0E2612BE"/>
@@ -1517,7 +1726,7 @@
       </w:rPr>
     </w:lvl>
   </w:abstractNum>
-  <w:abstractNum w:abstractNumId="11" w15:restartNumberingAfterBreak="0">
+  <w:abstractNum w:abstractNumId="12" w15:restartNumberingAfterBreak="0">
     <w:nsid w:val="6BB00EBA"/>
     <w:multiLevelType w:val="hybridMultilevel"/>
     <w:tmpl w:val="39AE26A8"/>
@@ -1634,37 +1843,40 @@
     <w:abstractNumId w:val="0"/>
   </w:num>
   <w:num w:numId="2" w16cid:durableId="1728257188">
-    <w:abstractNumId w:val="11"/>
+    <w:abstractNumId w:val="12"/>
   </w:num>
   <w:num w:numId="3" w16cid:durableId="153835008">
     <w:abstractNumId w:val="1"/>
   </w:num>
   <w:num w:numId="4" w16cid:durableId="1980837419">
-    <w:abstractNumId w:val="7"/>
+    <w:abstractNumId w:val="8"/>
   </w:num>
   <w:num w:numId="5" w16cid:durableId="850290757">
-    <w:abstractNumId w:val="5"/>
+    <w:abstractNumId w:val="6"/>
   </w:num>
   <w:num w:numId="6" w16cid:durableId="1498306412">
     <w:abstractNumId w:val="4"/>
   </w:num>
   <w:num w:numId="7" w16cid:durableId="1516112888">
+    <w:abstractNumId w:val="11"/>
+  </w:num>
+  <w:num w:numId="8" w16cid:durableId="1016468278">
     <w:abstractNumId w:val="10"/>
   </w:num>
-  <w:num w:numId="8" w16cid:durableId="1016468278">
-    <w:abstractNumId w:val="9"/>
-  </w:num>
   <w:num w:numId="9" w16cid:durableId="544952327">
-    <w:abstractNumId w:val="6"/>
+    <w:abstractNumId w:val="7"/>
   </w:num>
   <w:num w:numId="10" w16cid:durableId="2103262755">
     <w:abstractNumId w:val="2"/>
   </w:num>
   <w:num w:numId="11" w16cid:durableId="2032493688">
-    <w:abstractNumId w:val="8"/>
+    <w:abstractNumId w:val="9"/>
   </w:num>
   <w:num w:numId="12" w16cid:durableId="927270041">
     <w:abstractNumId w:val="3"/>
+  </w:num>
+  <w:num w:numId="13" w16cid:durableId="780732317">
+    <w:abstractNumId w:val="5"/>
   </w:num>
 </w:numbering>
 </file>
@@ -2063,9 +2275,9 @@
   <w:style w:type="paragraph" w:default="1" w:styleId="Standard">
     <w:name w:val="Normal"/>
     <w:qFormat/>
-    <w:rsid w:val="00097241"/>
-    <w:rPr>
-      <w:rFonts w:ascii="Calibri" w:hAnsi="Calibri"/>
+    <w:rsid w:val="009778FD"/>
+    <w:rPr>
+      <w:rFonts w:ascii="SF Pro" w:hAnsi="SF Pro"/>
       <w:color w:val="000000" w:themeColor="text1"/>
     </w:rPr>
   </w:style>
@@ -2354,6 +2566,7 @@
   <w:style w:type="paragraph" w:styleId="Listenabsatz">
     <w:name w:val="List Paragraph"/>
     <w:basedOn w:val="Standard"/>
+    <w:link w:val="ListenabsatzZchn"/>
     <w:uiPriority w:val="34"/>
     <w:qFormat/>
     <w:rsid w:val="00356643"/>
@@ -2515,13 +2728,14 @@
     <w:link w:val="TitelZchn"/>
     <w:uiPriority w:val="10"/>
     <w:qFormat/>
-    <w:rsid w:val="00C67951"/>
+    <w:rsid w:val="009778FD"/>
     <w:pPr>
       <w:spacing w:after="80"/>
       <w:contextualSpacing/>
     </w:pPr>
     <w:rPr>
-      <w:rFonts w:asciiTheme="majorHAnsi" w:eastAsiaTheme="majorEastAsia" w:hAnsiTheme="majorHAnsi" w:cstheme="majorBidi"/>
+      <w:rFonts w:eastAsiaTheme="majorEastAsia" w:cstheme="majorBidi"/>
+      <w:b/>
       <w:color w:val="auto"/>
       <w:spacing w:val="-10"/>
       <w:kern w:val="28"/>
@@ -2534,9 +2748,10 @@
     <w:basedOn w:val="Absatz-Standardschriftart"/>
     <w:link w:val="Titel"/>
     <w:uiPriority w:val="10"/>
-    <w:rsid w:val="00C67951"/>
-    <w:rPr>
-      <w:rFonts w:asciiTheme="majorHAnsi" w:eastAsiaTheme="majorEastAsia" w:hAnsiTheme="majorHAnsi" w:cstheme="majorBidi"/>
+    <w:rsid w:val="009778FD"/>
+    <w:rPr>
+      <w:rFonts w:ascii="SF Pro" w:eastAsiaTheme="majorEastAsia" w:hAnsi="SF Pro" w:cstheme="majorBidi"/>
+      <w:b/>
       <w:spacing w:val="-10"/>
       <w:kern w:val="28"/>
       <w:sz w:val="56"/>
@@ -2687,15 +2902,21 @@
     <w:name w:val="etc_ueberschrift_1"/>
     <w:basedOn w:val="Listenabsatz"/>
     <w:next w:val="Standard"/>
+    <w:link w:val="etcueberschrift1Zchn"/>
     <w:qFormat/>
-    <w:rsid w:val="003E5628"/>
+    <w:rsid w:val="009778FD"/>
     <w:pPr>
+      <w:numPr>
+        <w:numId w:val="13"/>
+      </w:numPr>
       <w:spacing w:after="120"/>
-      <w:ind w:left="0"/>
+      <w:ind w:left="567" w:hanging="567"/>
     </w:pPr>
     <w:rPr>
+      <w:rFonts w:ascii="Menlo" w:hAnsi="Menlo"/>
       <w:b/>
       <w:bCs/>
+      <w:color w:val="587F53"/>
       <w:sz w:val="28"/>
     </w:rPr>
   </w:style>
@@ -2738,6 +2959,30 @@
         <w:numId w:val="12"/>
       </w:numPr>
     </w:pPr>
+  </w:style>
+  <w:style w:type="character" w:customStyle="1" w:styleId="ListenabsatzZchn">
+    <w:name w:val="Listenabsatz Zchn"/>
+    <w:basedOn w:val="Absatz-Standardschriftart"/>
+    <w:link w:val="Listenabsatz"/>
+    <w:uiPriority w:val="34"/>
+    <w:rsid w:val="007914C8"/>
+    <w:rPr>
+      <w:rFonts w:ascii="Calibri" w:hAnsi="Calibri"/>
+      <w:color w:val="000000" w:themeColor="text1"/>
+    </w:rPr>
+  </w:style>
+  <w:style w:type="character" w:customStyle="1" w:styleId="etcueberschrift1Zchn">
+    <w:name w:val="etc_ueberschrift_1 Zchn"/>
+    <w:basedOn w:val="ListenabsatzZchn"/>
+    <w:link w:val="etcueberschrift1"/>
+    <w:rsid w:val="009778FD"/>
+    <w:rPr>
+      <w:rFonts w:ascii="Menlo" w:hAnsi="Menlo"/>
+      <w:b/>
+      <w:bCs/>
+      <w:color w:val="587F53"/>
+      <w:sz w:val="28"/>
+    </w:rPr>
   </w:style>
 </w:styles>
 </file>

</xml_diff>

<commit_message>
add website to game vision
</commit_message>
<xml_diff>
--- a/docs/product/docFiles/game-vision.docx
+++ b/docs/product/docFiles/game-vision.docx
@@ -14,7 +14,7 @@
           <w:noProof/>
         </w:rPr>
         <w:drawing>
-          <wp:inline distT="0" distB="0" distL="0" distR="0" wp14:anchorId="63A57654" wp14:editId="2C36931A">
+          <wp:inline distT="0" distB="0" distL="0" distR="0" wp14:anchorId="63A57654" wp14:editId="29F4DA17">
             <wp:extent cx="3285066" cy="967619"/>
             <wp:effectExtent l="0" t="0" r="4445" b="0"/>
             <wp:docPr id="346673291" name="Grafik 1"/>
@@ -58,6 +58,45 @@
     </w:p>
     <w:p>
       <w:pPr>
+        <w:jc w:val="center"/>
+        <w:rPr>
+          <w:b/>
+          <w:bCs/>
+          <w:lang w:eastAsia="de-DE"/>
+        </w:rPr>
+      </w:pPr>
+      <w:hyperlink r:id="rId8" w:history="1">
+        <w:r>
+          <w:rPr>
+            <w:rStyle w:val="Hyperlink"/>
+            <w:b/>
+            <w:bCs/>
+            <w:lang w:eastAsia="de-DE"/>
+          </w:rPr>
+          <w:t>esca</w:t>
+        </w:r>
+        <w:r>
+          <w:rPr>
+            <w:rStyle w:val="Hyperlink"/>
+            <w:b/>
+            <w:bCs/>
+            <w:lang w:eastAsia="de-DE"/>
+          </w:rPr>
+          <w:t>p</w:t>
+        </w:r>
+        <w:r>
+          <w:rPr>
+            <w:rStyle w:val="Hyperlink"/>
+            <w:b/>
+            <w:bCs/>
+            <w:lang w:eastAsia="de-DE"/>
+          </w:rPr>
+          <w:t>ethecomputer.eu</w:t>
+        </w:r>
+      </w:hyperlink>
+    </w:p>
+    <w:p>
+      <w:pPr>
         <w:rPr>
           <w:lang w:eastAsia="de-DE"/>
         </w:rPr>
@@ -302,7 +341,7 @@
       </w:r>
     </w:p>
     <w:sectPr>
-      <w:footerReference w:type="default" r:id="rId8"/>
+      <w:footerReference w:type="default" r:id="rId9"/>
       <w:pgSz w:w="11900" w:h="16840"/>
       <w:pgMar w:top="567" w:right="1418" w:bottom="1134" w:left="1418" w:header="709" w:footer="709" w:gutter="0"/>
       <w:cols w:space="708"/>
@@ -2984,6 +3023,18 @@
       <w:sz w:val="28"/>
     </w:rPr>
   </w:style>
+  <w:style w:type="character" w:styleId="BesuchterLink">
+    <w:name w:val="FollowedHyperlink"/>
+    <w:basedOn w:val="Absatz-Standardschriftart"/>
+    <w:uiPriority w:val="99"/>
+    <w:semiHidden/>
+    <w:unhideWhenUsed/>
+    <w:rsid w:val="00337673"/>
+    <w:rPr>
+      <w:color w:val="96607D" w:themeColor="followedHyperlink"/>
+      <w:u w:val="single"/>
+    </w:rPr>
+  </w:style>
 </w:styles>
 </file>
 

</xml_diff>